<commit_message>
Syncing Week 28 Homework Assignments
</commit_message>
<xml_diff>
--- a/Week28/screenshots/theo-approval-or-extension.docx
+++ b/Week28/screenshots/theo-approval-or-extension.docx
@@ -1,27 +1,47 @@
 
 <file path=word/document.xml><?xml version="1.0" encoding="utf-8"?>
-<w:document xmlns:mc="http://schemas.openxmlformats.org/markup-compatibility/2006" xmlns:o="urn:schemas-microsoft-com:office:office" xmlns:r="http://schemas.openxmlformats.org/officeDocument/2006/relationships" xmlns:m="http://schemas.openxmlformats.org/officeDocument/2006/math" xmlns:v="urn:schemas-microsoft-com:vml" xmlns:wp="http://schemas.openxmlformats.org/drawingml/2006/wordprocessingDrawing" xmlns:w10="urn:schemas-microsoft-com:office:word" xmlns:w="http://schemas.openxmlformats.org/wordprocessingml/2006/main" xmlns:wne="http://schemas.microsoft.com/office/word/2006/wordml" xmlns:sl="http://schemas.openxmlformats.org/schemaLibrary/2006/main" xmlns:a="http://schemas.openxmlformats.org/drawingml/2006/main" xmlns:pic="http://schemas.openxmlformats.org/drawingml/2006/picture" xmlns:c="http://schemas.openxmlformats.org/drawingml/2006/chart" xmlns:lc="http://schemas.openxmlformats.org/drawingml/2006/lockedCanvas" xmlns:dgm="http://schemas.openxmlformats.org/drawingml/2006/diagram" xmlns:wps="http://schemas.microsoft.com/office/word/2010/wordprocessingShape" xmlns:wpg="http://schemas.microsoft.com/office/word/2010/wordprocessingGroup" xmlns:w14="http://schemas.microsoft.com/office/word/2010/wordml" xmlns:w15="http://schemas.microsoft.com/office/word/2012/wordml" xmlns:w16="http://schemas.microsoft.com/office/word/2018/wordml" xmlns:w16cex="http://schemas.microsoft.com/office/word/2018/wordml/cex" xmlns:w16cid="http://schemas.microsoft.com/office/word/2016/wordml/cid" xmlns="http://schemas.microsoft.com/office/tasks/2019/documenttasks" xmlns:cr="http://schemas.microsoft.com/office/comments/2020/reactions">
+<w:document xmlns:wp14="http://schemas.microsoft.com/office/word/2010/wordprocessingDrawing" xmlns:mc="http://schemas.openxmlformats.org/markup-compatibility/2006" xmlns:o="urn:schemas-microsoft-com:office:office" xmlns:r="http://schemas.openxmlformats.org/officeDocument/2006/relationships" xmlns:m="http://schemas.openxmlformats.org/officeDocument/2006/math" xmlns:v="urn:schemas-microsoft-com:vml" xmlns:wp="http://schemas.openxmlformats.org/drawingml/2006/wordprocessingDrawing" xmlns:w10="urn:schemas-microsoft-com:office:word" xmlns:w="http://schemas.openxmlformats.org/wordprocessingml/2006/main" xmlns:wne="http://schemas.microsoft.com/office/word/2006/wordml" xmlns:sl="http://schemas.openxmlformats.org/schemaLibrary/2006/main" xmlns:a="http://schemas.openxmlformats.org/drawingml/2006/main" xmlns:pic="http://schemas.openxmlformats.org/drawingml/2006/picture" xmlns:c="http://schemas.openxmlformats.org/drawingml/2006/chart" xmlns:lc="http://schemas.openxmlformats.org/drawingml/2006/lockedCanvas" xmlns:dgm="http://schemas.openxmlformats.org/drawingml/2006/diagram" xmlns:wps="http://schemas.microsoft.com/office/word/2010/wordprocessingShape" xmlns:wpg="http://schemas.microsoft.com/office/word/2010/wordprocessingGroup" xmlns:w14="http://schemas.microsoft.com/office/word/2010/wordml" xmlns:w15="http://schemas.microsoft.com/office/word/2012/wordml" xmlns:w16="http://schemas.microsoft.com/office/word/2018/wordml" xmlns:w16cex="http://schemas.microsoft.com/office/word/2018/wordml/cex" xmlns:w16cid="http://schemas.microsoft.com/office/word/2016/wordml/cid" xmlns="http://schemas.microsoft.com/office/tasks/2019/documenttasks" xmlns:cr="http://schemas.microsoft.com/office/comments/2020/reactions" mc:Ignorable="wp14">
   <w:body>
-    <w:p>
+    <w:p xmlns:wp14="http://schemas.microsoft.com/office/word/2010/wordml" wp14:textId="77777777">
+      <w:pPr>
+        <w:rPr>
+          <w:b w:val="1"/>
+          <w:bCs w:val="1"/>
+          <w:highlight w:val="yellow"/>
+          <w:rtl w:val="0"/>
+        </w:rPr>
+      </w:pPr>
+      <w:r>
+        <w:rPr>
+          <w:b w:val="1"/>
+          <w:bCs w:val="1"/>
+        </w:rPr>
+        <w:t>Status:</w:t>
+      </w:r>
+      <w:r>
+        <w:rPr/>
+        <w:t xml:space="preserve"> </w:t>
+      </w:r>
+      <w:r>
+        <w:rPr>
+          <w:b w:val="1"/>
+          <w:bCs w:val="1"/>
+          <w:highlight w:val="yellow"/>
+        </w:rPr>
+        <w:t>Waiting…</w:t>
+      </w:r>
+    </w:p>
+    <w:p xmlns:wp14="http://schemas.microsoft.com/office/word/2010/wordml" wp14:textId="77777777">
       <w:pPr>
         <w:rPr/>
       </w:pPr>
       <w:r>
         <w:rPr>
-          <w:b w:val="1"/>
-          <w:bCs w:val="1"/>
           <w:rtl w:val="0"/>
         </w:rPr>
-        <w:t xml:space="preserve">Status:</w:t>
-      </w:r>
-      <w:r>
-        <w:rPr>
-          <w:rtl w:val="0"/>
-        </w:rPr>
-        <w:t xml:space="preserve"> Waiting…</w:t>
       </w:r>
     </w:p>
-    <w:p>
+    <w:p xmlns:wp14="http://schemas.microsoft.com/office/word/2010/wordml" wp14:textId="77777777">
       <w:pPr>
         <w:rPr/>
       </w:pPr>
@@ -29,9 +49,10 @@
         <w:rPr>
           <w:rtl w:val="0"/>
         </w:rPr>
+        <w:t xml:space="preserve">Group Leader: Cameron Gilbert </w:t>
       </w:r>
     </w:p>
-    <w:p>
+    <w:p xmlns:wp14="http://schemas.microsoft.com/office/word/2010/wordml" wp14:textId="77777777">
       <w:pPr>
         <w:rPr/>
       </w:pPr>
@@ -39,10 +60,9 @@
         <w:rPr>
           <w:rtl w:val="0"/>
         </w:rPr>
-        <w:t xml:space="preserve">Group Leader: Cameron Gilbert </w:t>
       </w:r>
     </w:p>
-    <w:p>
+    <w:p xmlns:wp14="http://schemas.microsoft.com/office/word/2010/wordml" wp14:textId="77777777">
       <w:pPr>
         <w:rPr/>
       </w:pPr>
@@ -50,9 +70,79 @@
         <w:rPr>
           <w:rtl w:val="0"/>
         </w:rPr>
+        <w:t xml:space="preserve">Group Chat: Daniel</w:t>
       </w:r>
     </w:p>
-    <w:p>
+    <w:p xmlns:wp14="http://schemas.microsoft.com/office/word/2010/wordml" wp14:textId="77777777">
+      <w:pPr/>
+      <w:r>
+        <w:rPr>
+          <w:lang w:val="en-US"/>
+        </w:rPr>
+        <w:t xml:space="preserve">Rob said that we should still </w:t>
+      </w:r>
+      <w:r>
+        <w:rPr>
+          <w:lang w:val="en-US"/>
+        </w:rPr>
+        <w:t>submit</w:t>
+      </w:r>
+      <w:r>
+        <w:rPr>
+          <w:lang w:val="en-US"/>
+        </w:rPr>
+        <w:t xml:space="preserve"> the assignment even if we </w:t>
+      </w:r>
+      <w:r>
+        <w:rPr>
+          <w:lang w:val="en-US"/>
+        </w:rPr>
+        <w:t>haven’t</w:t>
+      </w:r>
+      <w:r>
+        <w:rPr>
+          <w:lang w:val="en-US"/>
+        </w:rPr>
+        <w:t xml:space="preserve"> gotten </w:t>
+      </w:r>
+      <w:r>
+        <w:rPr>
+          <w:lang w:val="en-US"/>
+        </w:rPr>
+        <w:t>sign</w:t>
+      </w:r>
+      <w:r>
+        <w:rPr>
+          <w:lang w:val="en-US"/>
+        </w:rPr>
+        <w:t xml:space="preserve"> off. Either include a placeholder file or the screenshot of the submission we sent. There are multiple people who </w:t>
+      </w:r>
+      <w:r>
+        <w:rPr>
+          <w:lang w:val="en-US"/>
+        </w:rPr>
+        <w:t>seem to still be</w:t>
+      </w:r>
+      <w:r>
+        <w:rPr>
+          <w:lang w:val="en-US"/>
+        </w:rPr>
+        <w:t xml:space="preserve"> waiting on sign off. So </w:t>
+      </w:r>
+      <w:r>
+        <w:rPr>
+          <w:lang w:val="en-US"/>
+        </w:rPr>
+        <w:t>again</w:t>
+      </w:r>
+      <w:r>
+        <w:rPr>
+          <w:lang w:val="en-US"/>
+        </w:rPr>
+        <w:t xml:space="preserve"> still submit that homework</w:t>
+      </w:r>
+    </w:p>
+    <w:p xmlns:wp14="http://schemas.microsoft.com/office/word/2010/wordml" wp14:textId="77777777">
       <w:pPr>
         <w:rPr/>
       </w:pPr>
@@ -60,34 +150,13 @@
         <w:rPr>
           <w:rtl w:val="0"/>
         </w:rPr>
-        <w:t xml:space="preserve">Group Chat: Daniel</w:t>
-      </w:r>
-    </w:p>
-    <w:p>
-      <w:pPr>
-        <w:rPr/>
-      </w:pPr>
-      <w:r>
-        <w:rPr>
-          <w:rtl w:val="0"/>
-        </w:rPr>
-        <w:t xml:space="preserve">Rob said that we should still submit the assignment even if we haven’t gotten sign off. Either include a placeholder file or the screenshot of the submission we sent. There are multiple people who seem to still be waiting on sign off. So again still submit that homework</w:t>
-      </w:r>
-    </w:p>
-    <w:p>
-      <w:pPr>
-        <w:rPr/>
-      </w:pPr>
-      <w:r>
-        <w:rPr>
-          <w:rtl w:val="0"/>
-        </w:rPr>
       </w:r>
     </w:p>
     <w:sectPr>
-      <w:pgSz w:h="15840" w:w="12240" w:orient="portrait"/>
-      <w:pgMar w:bottom="1440" w:top="1440" w:left="1440" w:right="1440" w:header="720" w:footer="720"/>
+      <w:pgSz w:w="12240" w:h="15840" w:orient="portrait"/>
+      <w:pgMar w:top="1440" w:right="1440" w:bottom="1440" w:left="1440" w:header="720" w:footer="720"/>
       <w:pgNumType w:start="1"/>
+      <w:cols w:num="1"/>
     </w:sectPr>
   </w:body>
 </w:document>
@@ -98,11 +167,11 @@
 </file>
 
 <file path=word/styles.xml><?xml version="1.0" encoding="utf-8"?>
-<w:styles xmlns:mc="http://schemas.openxmlformats.org/markup-compatibility/2006" xmlns:o="urn:schemas-microsoft-com:office:office" xmlns:r="http://schemas.openxmlformats.org/officeDocument/2006/relationships" xmlns:m="http://schemas.openxmlformats.org/officeDocument/2006/math" xmlns:v="urn:schemas-microsoft-com:vml" xmlns:wp="http://schemas.openxmlformats.org/drawingml/2006/wordprocessingDrawing" xmlns:w10="urn:schemas-microsoft-com:office:word" xmlns:w="http://schemas.openxmlformats.org/wordprocessingml/2006/main" xmlns:wne="http://schemas.microsoft.com/office/word/2006/wordml" xmlns:sl="http://schemas.openxmlformats.org/schemaLibrary/2006/main" xmlns:a="http://schemas.openxmlformats.org/drawingml/2006/main" xmlns:pic="http://schemas.openxmlformats.org/drawingml/2006/picture" xmlns:c="http://schemas.openxmlformats.org/drawingml/2006/chart" xmlns:lc="http://schemas.openxmlformats.org/drawingml/2006/lockedCanvas" xmlns:dgm="http://schemas.openxmlformats.org/drawingml/2006/diagram" xmlns:wps="http://schemas.microsoft.com/office/word/2010/wordprocessingShape" xmlns:wpg="http://schemas.microsoft.com/office/word/2010/wordprocessingGroup" xmlns:w14="http://schemas.microsoft.com/office/word/2010/wordml" xmlns:w15="http://schemas.microsoft.com/office/word/2012/wordml" xmlns:w16="http://schemas.microsoft.com/office/word/2018/wordml" xmlns:w16cex="http://schemas.microsoft.com/office/word/2018/wordml/cex" xmlns:w16cid="http://schemas.microsoft.com/office/word/2016/wordml/cid" xmlns="http://schemas.microsoft.com/office/tasks/2019/documenttasks" xmlns:cr="http://schemas.microsoft.com/office/comments/2020/reactions">
+<w:styles xmlns:wp14="http://schemas.microsoft.com/office/word/2010/wordprocessingDrawing" xmlns:mc="http://schemas.openxmlformats.org/markup-compatibility/2006" xmlns:o="urn:schemas-microsoft-com:office:office" xmlns:r="http://schemas.openxmlformats.org/officeDocument/2006/relationships" xmlns:m="http://schemas.openxmlformats.org/officeDocument/2006/math" xmlns:v="urn:schemas-microsoft-com:vml" xmlns:wp="http://schemas.openxmlformats.org/drawingml/2006/wordprocessingDrawing" xmlns:w10="urn:schemas-microsoft-com:office:word" xmlns:w="http://schemas.openxmlformats.org/wordprocessingml/2006/main" xmlns:wne="http://schemas.microsoft.com/office/word/2006/wordml" xmlns:sl="http://schemas.openxmlformats.org/schemaLibrary/2006/main" xmlns:a="http://schemas.openxmlformats.org/drawingml/2006/main" xmlns:pic="http://schemas.openxmlformats.org/drawingml/2006/picture" xmlns:c="http://schemas.openxmlformats.org/drawingml/2006/chart" xmlns:lc="http://schemas.openxmlformats.org/drawingml/2006/lockedCanvas" xmlns:dgm="http://schemas.openxmlformats.org/drawingml/2006/diagram" xmlns:wps="http://schemas.microsoft.com/office/word/2010/wordprocessingShape" xmlns:wpg="http://schemas.microsoft.com/office/word/2010/wordprocessingGroup" xmlns:w14="http://schemas.microsoft.com/office/word/2010/wordml" xmlns:w15="http://schemas.microsoft.com/office/word/2012/wordml" xmlns:w16="http://schemas.microsoft.com/office/word/2018/wordml" xmlns:w16cex="http://schemas.microsoft.com/office/word/2018/wordml/cex" xmlns:w16cid="http://schemas.microsoft.com/office/word/2016/wordml/cid" xmlns="http://schemas.microsoft.com/office/tasks/2019/documenttasks" xmlns:cr="http://schemas.microsoft.com/office/comments/2020/reactions" mc:Ignorable="wp14">
   <w:docDefaults>
     <w:rPrDefault>
       <w:rPr>
-        <w:rFonts w:ascii="Arial" w:cs="Arial" w:eastAsia="Arial" w:hAnsi="Arial"/>
+        <w:rFonts w:ascii="Arial" w:hAnsi="Arial" w:eastAsia="Arial" w:cs="Arial"/>
         <w:sz w:val="22"/>
         <w:szCs w:val="22"/>
         <w:lang w:val="en"/>
@@ -115,7 +184,7 @@
     </w:pPrDefault>
   </w:docDefaults>
   <w:style w:type="table" w:styleId="TableNormal" w:default="1">
-    <w:name w:val="TableNormal"/>
+    <w:name w:val="Normal Table"/>
     <w:tblPr>
       <w:tblCellMar>
         <w:top w:w="100.0" w:type="dxa"/>
@@ -126,7 +195,7 @@
     </w:tblPr>
   </w:style>
   <w:style w:type="paragraph" w:styleId="Normal" w:default="1">
-    <w:name w:val="normal"/>
+    <w:name w:val="Normal"/>
   </w:style>
   <w:style w:type="paragraph" w:styleId="Heading1">
     <w:name w:val="heading 1"/>
@@ -136,7 +205,7 @@
       <w:keepNext w:val="1"/>
       <w:keepLines w:val="1"/>
       <w:pageBreakBefore w:val="0"/>
-      <w:spacing w:after="120" w:before="400" w:lineRule="auto"/>
+      <w:spacing w:before="400" w:after="120" w:lineRule="auto"/>
     </w:pPr>
     <w:rPr>
       <w:sz w:val="40"/>
@@ -151,7 +220,7 @@
       <w:keepNext w:val="1"/>
       <w:keepLines w:val="1"/>
       <w:pageBreakBefore w:val="0"/>
-      <w:spacing w:after="120" w:before="360" w:lineRule="auto"/>
+      <w:spacing w:before="360" w:after="120" w:lineRule="auto"/>
     </w:pPr>
     <w:rPr>
       <w:b w:val="0"/>
@@ -168,7 +237,7 @@
       <w:keepNext w:val="1"/>
       <w:keepLines w:val="1"/>
       <w:pageBreakBefore w:val="0"/>
-      <w:spacing w:after="80" w:before="320" w:lineRule="auto"/>
+      <w:spacing w:before="320" w:after="80" w:lineRule="auto"/>
     </w:pPr>
     <w:rPr>
       <w:b w:val="0"/>
@@ -186,7 +255,7 @@
       <w:keepNext w:val="1"/>
       <w:keepLines w:val="1"/>
       <w:pageBreakBefore w:val="0"/>
-      <w:spacing w:after="80" w:before="280" w:lineRule="auto"/>
+      <w:spacing w:before="280" w:after="80" w:lineRule="auto"/>
     </w:pPr>
     <w:rPr>
       <w:color w:val="666666"/>
@@ -202,7 +271,7 @@
       <w:keepNext w:val="1"/>
       <w:keepLines w:val="1"/>
       <w:pageBreakBefore w:val="0"/>
-      <w:spacing w:after="80" w:before="240" w:lineRule="auto"/>
+      <w:spacing w:before="240" w:after="80" w:lineRule="auto"/>
     </w:pPr>
     <w:rPr>
       <w:color w:val="666666"/>
@@ -218,7 +287,7 @@
       <w:keepNext w:val="1"/>
       <w:keepLines w:val="1"/>
       <w:pageBreakBefore w:val="0"/>
-      <w:spacing w:after="80" w:before="240" w:lineRule="auto"/>
+      <w:spacing w:before="240" w:after="80" w:lineRule="auto"/>
     </w:pPr>
     <w:rPr>
       <w:i w:val="1"/>
@@ -236,7 +305,7 @@
       <w:keepNext w:val="1"/>
       <w:keepLines w:val="1"/>
       <w:pageBreakBefore w:val="0"/>
-      <w:spacing w:after="60" w:before="0" w:lineRule="auto"/>
+      <w:spacing w:before="0" w:after="60" w:lineRule="auto"/>
     </w:pPr>
     <w:rPr>
       <w:sz w:val="52"/>
@@ -251,10 +320,10 @@
       <w:keepNext w:val="1"/>
       <w:keepLines w:val="1"/>
       <w:pageBreakBefore w:val="0"/>
-      <w:spacing w:after="320" w:before="0" w:lineRule="auto"/>
-    </w:pPr>
-    <w:rPr>
-      <w:rFonts w:ascii="Arial" w:cs="Arial" w:eastAsia="Arial" w:hAnsi="Arial"/>
+      <w:spacing w:before="0" w:after="320" w:lineRule="auto"/>
+    </w:pPr>
+    <w:rPr>
+      <w:rFonts w:ascii="Arial" w:hAnsi="Arial" w:eastAsia="Arial" w:cs="Arial"/>
       <w:i w:val="0"/>
       <w:iCs w:val="0"/>
       <w:color w:val="666666"/>

</xml_diff>